<commit_message>
templates: unify all price tables to single fixed-width pair
Replace both price-table pairs (7-col with line-discount + 6-col
no-discount variants) in every quote template with the single fixed
pair from אוויר-תוך-מבנית. The grafted items table uses
tblLayout=fixed with a fixed 10466-dxa width so a long "תיאור המוצר"
wraps inside the cell instead of stretching the table.

- 79 production templates updated; example.docx and dev/source files
  (_mapping-check, kol-holem-*) left untouched (also railwayignored)
- Non-price tables (logo/ISO/images, milestone tables) preserved
- Grafted pair keeps all runtime merge placeholders
  ({#items}, {lineDiscountPercent}, {discountPercent},
  {subtotalAfterDiscount}, {vatAmount}, {totalAmount}) so the
  discount-column/row transforms in DocxMergeService still apply

Co-Authored-By: Claude Opus 4.8 (1M context) <noreply@anthropic.com>
</commit_message>
<xml_diff>
--- a/apps/api/templates/אוויר-הצעת-מחיר-לבדיקת-איכות-אוויר-מתחבורה.docx
+++ b/apps/api/templates/אוויר-הצעת-מחיר-לבדיקת-איכות-אוויר-מתחבורה.docx
@@ -1574,7 +1574,8 @@
     <w:tbl>
       <w:tblPr>
         <w:bidiVisual/>
-        <w:tblW w:w="0" w:type="auto"/>
+        <w:tblW w:w="10466" w:type="dxa"/>
+        <w:tblLayout w:type="fixed"/>
         <w:tblBorders>
           <w:top w:val="single" w:sz="4" w:space="0" w:color="auto"/>
           <w:left w:val="single" w:sz="4" w:space="0" w:color="auto"/>
@@ -1586,867 +1587,25 @@
         <w:tblLook w:val="04A0" w:firstRow="1" w:lastRow="0" w:firstColumn="1" w:lastColumn="0" w:noHBand="0" w:noVBand="1"/>
       </w:tblPr>
       <w:tblGrid>
-        <w:gridCol w:w="911"/>
-        <w:gridCol w:w="911"/>
-        <w:gridCol w:w="3142"/>
-        <w:gridCol w:w="851"/>
-        <w:gridCol w:w="1177"/>
-        <w:gridCol w:w="1073"/>
-        <w:gridCol w:w="1764"/>
+        <w:gridCol w:w="700"/>
+        <w:gridCol w:w="900"/>
+        <w:gridCol w:w="2900"/>
+        <w:gridCol w:w="900"/>
+        <w:gridCol w:w="1400"/>
+        <w:gridCol w:w="1400"/>
+        <w:gridCol w:w="2266"/>
       </w:tblGrid>
       <w:tr>
         <w:tc>
           <w:tcPr>
-            <w:tcW w:w="911" w:type="dxa"/>
-          </w:tcPr>
-          <w:p>
-            <w:pPr>
-              <w:rPr>
-                <w:rFonts w:cs="David" w:hint="cs"/>
-                <w:b/>
-                <w:bCs/>
-                <w:sz w:val="28"/>
-                <w:szCs w:val="28"/>
-                <w:rtl/>
-              </w:rPr>
-            </w:pPr>
-            <w:r>
-              <w:rPr>
-                <w:rFonts w:cs="David" w:hint="cs"/>
-                <w:b/>
-                <w:bCs/>
-                <w:sz w:val="28"/>
-                <w:szCs w:val="28"/>
-                <w:rtl/>
-              </w:rPr>
-              <w:t>שורה</w:t>
-            </w:r>
-          </w:p>
-        </w:tc>
-        <w:tc>
-          <w:tcPr>
-            <w:tcW w:w="911" w:type="dxa"/>
-          </w:tcPr>
-          <w:p>
-            <w:pPr>
-              <w:rPr>
-                <w:rFonts w:cs="David" w:hint="cs"/>
-                <w:b/>
-                <w:bCs/>
-                <w:sz w:val="28"/>
-                <w:szCs w:val="28"/>
-                <w:rtl/>
-              </w:rPr>
-            </w:pPr>
-            <w:r>
-              <w:rPr>
-                <w:rFonts w:cs="David" w:hint="cs"/>
-                <w:b/>
-                <w:bCs/>
-                <w:sz w:val="28"/>
-                <w:szCs w:val="28"/>
-                <w:rtl/>
-              </w:rPr>
-              <w:t xml:space="preserve">מק"ט </w:t>
-            </w:r>
-          </w:p>
-        </w:tc>
-        <w:tc>
-          <w:tcPr>
-            <w:tcW w:w="3142" w:type="dxa"/>
-          </w:tcPr>
-          <w:p>
-            <w:pPr>
-              <w:rPr>
-                <w:rFonts w:cs="David" w:hint="cs"/>
-                <w:b/>
-                <w:bCs/>
-                <w:sz w:val="28"/>
-                <w:szCs w:val="28"/>
-                <w:rtl/>
-              </w:rPr>
-            </w:pPr>
-            <w:r>
-              <w:rPr>
-                <w:rFonts w:cs="David" w:hint="cs"/>
-                <w:b/>
-                <w:bCs/>
-                <w:sz w:val="28"/>
-                <w:szCs w:val="28"/>
-                <w:rtl/>
-              </w:rPr>
-              <w:t>תיאור המוצר</w:t>
-            </w:r>
-          </w:p>
-        </w:tc>
-        <w:tc>
-          <w:tcPr>
-            <w:tcW w:w="851" w:type="dxa"/>
-          </w:tcPr>
-          <w:p>
-            <w:pPr>
-              <w:rPr>
-                <w:rFonts w:cs="David" w:hint="cs"/>
-                <w:b/>
-                <w:bCs/>
-                <w:sz w:val="28"/>
-                <w:szCs w:val="28"/>
-                <w:rtl/>
-              </w:rPr>
-            </w:pPr>
-            <w:r>
-              <w:rPr>
-                <w:rFonts w:cs="David" w:hint="cs"/>
-                <w:b/>
-                <w:bCs/>
-                <w:sz w:val="28"/>
-                <w:szCs w:val="28"/>
-                <w:rtl/>
-              </w:rPr>
-              <w:t>כמות</w:t>
-            </w:r>
-          </w:p>
-        </w:tc>
-        <w:tc>
-          <w:tcPr>
-            <w:tcW w:w="1177" w:type="dxa"/>
-          </w:tcPr>
-          <w:p>
-            <w:pPr>
-              <w:rPr>
-                <w:rFonts w:cs="David" w:hint="cs"/>
-                <w:b/>
-                <w:bCs/>
-                <w:sz w:val="28"/>
-                <w:szCs w:val="28"/>
-                <w:rtl/>
-              </w:rPr>
-            </w:pPr>
-            <w:r>
-              <w:rPr>
-                <w:rFonts w:cs="David" w:hint="cs"/>
-                <w:b/>
-                <w:bCs/>
-                <w:sz w:val="28"/>
-                <w:szCs w:val="28"/>
-                <w:rtl/>
-              </w:rPr>
-              <w:t>מחיר ליחידה</w:t>
-            </w:r>
-          </w:p>
-        </w:tc>
-        <w:tc>
-          <w:tcPr>
-            <w:tcW w:w="1073" w:type="dxa"/>
-          </w:tcPr>
-          <w:p>
-            <w:pPr>
-              <w:rPr>
-                <w:rFonts w:cs="David" w:hint="cs"/>
-                <w:b/>
-                <w:bCs/>
-                <w:sz w:val="28"/>
-                <w:szCs w:val="28"/>
-                <w:rtl/>
-              </w:rPr>
-            </w:pPr>
-            <w:r>
-              <w:rPr>
-                <w:rFonts w:cs="David" w:hint="cs"/>
-                <w:b/>
-                <w:bCs/>
-                <w:sz w:val="28"/>
-                <w:szCs w:val="28"/>
-                <w:rtl/>
-              </w:rPr>
-              <w:t xml:space="preserve">% הנחה לשורה </w:t>
-            </w:r>
-          </w:p>
-        </w:tc>
-        <w:tc>
-          <w:tcPr>
-            <w:tcW w:w="1764" w:type="dxa"/>
-          </w:tcPr>
-          <w:p>
-            <w:pPr>
-              <w:rPr>
-                <w:rFonts w:cs="David" w:hint="cs"/>
-                <w:b/>
-                <w:bCs/>
-                <w:sz w:val="28"/>
-                <w:szCs w:val="28"/>
-                <w:rtl/>
-              </w:rPr>
-            </w:pPr>
-            <w:r>
-              <w:rPr>
-                <w:rFonts w:cs="David" w:hint="cs"/>
-                <w:b/>
-                <w:bCs/>
-                <w:sz w:val="28"/>
-                <w:szCs w:val="28"/>
-                <w:rtl/>
-              </w:rPr>
-              <w:t>סה"כ ₪</w:t>
-            </w:r>
-          </w:p>
-          <w:p>
-            <w:pPr>
-              <w:rPr>
-                <w:rFonts w:cs="David" w:hint="cs"/>
-                <w:b/>
-                <w:bCs/>
-                <w:sz w:val="28"/>
-                <w:szCs w:val="28"/>
-                <w:rtl/>
-              </w:rPr>
-            </w:pPr>
-          </w:p>
-        </w:tc>
-      </w:tr>
-      <w:tr>
-        <w:tc>
-          <w:tcPr>
-            <w:tcW w:w="911" w:type="dxa"/>
-          </w:tcPr>
-          <w:p>
-            <w:pPr>
-              <w:rPr>
-                <w:rFonts w:cs="David" w:hint="cs"/>
-                <w:b/>
-                <w:bCs/>
-                <w:sz w:val="28"/>
-                <w:szCs w:val="28"/>
-                <w:rtl/>
-              </w:rPr>
-            </w:pPr>
-            <w:r>
-              <w:rPr>
-                <w:rFonts w:cs="David" w:hint="cs"/>
-                <w:b/>
-                <w:bCs/>
-                <w:sz w:val="28"/>
-                <w:szCs w:val="28"/>
-                <w:rtl/>
-              </w:rPr>
-              <w:t xml:space="preserve">{#items}{lineNumber}</w:t>
-            </w:r>
-          </w:p>
-        </w:tc>
-        <w:tc>
-          <w:tcPr>
-            <w:tcW w:w="911" w:type="dxa"/>
-          </w:tcPr>
-          <w:p>
-            <w:pPr>
-              <w:rPr>
-                <w:rFonts w:cs="David" w:hint="cs"/>
-                <w:b/>
-                <w:bCs/>
-                <w:sz w:val="28"/>
-                <w:szCs w:val="28"/>
-                <w:rtl/>
-              </w:rPr>
-            </w:pPr>
-            <w:r>
-              <w:rPr>
-                <w:rFonts w:cs="David" w:hint="cs"/>
-                <w:b/>
-                <w:bCs/>
-                <w:sz w:val="28"/>
-                <w:szCs w:val="28"/>
-                <w:rtl/>
-              </w:rPr>
-              <w:t xml:space="preserve">{itemCode}</w:t>
-            </w:r>
-          </w:p>
-        </w:tc>
-        <w:tc>
-          <w:tcPr>
-            <w:tcW w:w="3142" w:type="dxa"/>
-          </w:tcPr>
-          <w:p>
-            <w:pPr>
-              <w:rPr>
-                <w:rFonts w:cs="David" w:hint="cs"/>
-                <w:b/>
-                <w:bCs/>
-                <w:sz w:val="28"/>
-                <w:szCs w:val="28"/>
-                <w:rtl/>
-              </w:rPr>
-            </w:pPr>
-            <w:r>
-              <w:rPr>
-                <w:rFonts w:cs="David" w:hint="cs"/>
-                <w:b/>
-                <w:bCs/>
-                <w:sz w:val="28"/>
-                <w:szCs w:val="28"/>
-                <w:rtl/>
-              </w:rPr>
-              <w:t xml:space="preserve">{description}</w:t>
-            </w:r>
-          </w:p>
-        </w:tc>
-        <w:tc>
-          <w:tcPr>
-            <w:tcW w:w="851" w:type="dxa"/>
-          </w:tcPr>
-          <w:p>
-            <w:pPr>
-              <w:rPr>
-                <w:rFonts w:cs="David" w:hint="cs"/>
-                <w:b/>
-                <w:bCs/>
-                <w:sz w:val="28"/>
-                <w:szCs w:val="28"/>
-                <w:rtl/>
-              </w:rPr>
-            </w:pPr>
-            <w:r>
-              <w:rPr>
-                <w:rFonts w:cs="David" w:hint="cs"/>
-                <w:b/>
-                <w:bCs/>
-                <w:sz w:val="28"/>
-                <w:szCs w:val="28"/>
-                <w:rtl/>
-              </w:rPr>
-              <w:t xml:space="preserve">{quantity}</w:t>
-            </w:r>
-          </w:p>
-        </w:tc>
-        <w:tc>
-          <w:tcPr>
-            <w:tcW w:w="1177" w:type="dxa"/>
-          </w:tcPr>
-          <w:p>
-            <w:pPr>
-              <w:rPr>
-                <w:rFonts w:cs="David" w:hint="cs"/>
-                <w:b/>
-                <w:bCs/>
-                <w:sz w:val="28"/>
-                <w:szCs w:val="28"/>
-                <w:rtl/>
-              </w:rPr>
-            </w:pPr>
-            <w:r>
-              <w:rPr>
-                <w:rFonts w:cs="David" w:hint="cs"/>
-                <w:b/>
-                <w:bCs/>
-                <w:sz w:val="28"/>
-                <w:szCs w:val="28"/>
-                <w:rtl/>
-              </w:rPr>
-              <w:t xml:space="preserve">{unitPrice}</w:t>
-            </w:r>
-          </w:p>
-        </w:tc>
-        <w:tc>
-          <w:tcPr>
-            <w:tcW w:w="1073" w:type="dxa"/>
-          </w:tcPr>
-          <w:p>
-            <w:pPr>
-              <w:rPr>
-                <w:rFonts w:cs="David" w:hint="cs"/>
-                <w:b/>
-                <w:bCs/>
-                <w:sz w:val="28"/>
-                <w:szCs w:val="28"/>
-                <w:rtl/>
-              </w:rPr>
-            </w:pPr>
-            <w:r>
-              <w:rPr>
-                <w:rFonts w:cs="David" w:hint="cs"/>
-                <w:b/>
-                <w:bCs/>
-                <w:sz w:val="28"/>
-                <w:szCs w:val="28"/>
-                <w:rtl/>
-              </w:rPr>
-              <w:t xml:space="preserve">{lineDiscountPercent}</w:t>
-            </w:r>
-          </w:p>
-        </w:tc>
-        <w:tc>
-          <w:tcPr>
-            <w:tcW w:w="1764" w:type="dxa"/>
-          </w:tcPr>
-          <w:p>
-            <w:pPr>
-              <w:rPr>
-                <w:rFonts w:cs="David" w:hint="cs"/>
-                <w:b/>
-                <w:bCs/>
-                <w:sz w:val="28"/>
-                <w:szCs w:val="28"/>
-                <w:rtl/>
-              </w:rPr>
-            </w:pPr>
-            <w:r>
-              <w:rPr>
-                <w:rFonts w:cs="David" w:hint="cs"/>
-                <w:b/>
-                <w:bCs/>
-                <w:sz w:val="28"/>
-                <w:szCs w:val="28"/>
-                <w:rtl/>
-              </w:rPr>
-              <w:t xml:space="preserve">{lineTotal}{/items}</w:t>
-            </w:r>
-          </w:p>
-        </w:tc>
-      </w:tr>
-    </w:tbl>
-    <w:p>
-      <w:pPr>
-        <w:rPr>
-          <w:vanish/>
-        </w:rPr>
-      </w:pPr>
-    </w:p>
-    <w:tbl>
-      <w:tblPr>
-        <w:tblpPr w:leftFromText="180" w:rightFromText="180" w:vertAnchor="text" w:horzAnchor="page" w:tblpX="1340" w:tblpY="199"/>
-        <w:bidiVisual/>
-        <w:tblW w:w="0" w:type="auto"/>
-        <w:tblBorders>
-          <w:top w:val="single" w:sz="4" w:space="0" w:color="auto"/>
-          <w:left w:val="single" w:sz="4" w:space="0" w:color="auto"/>
-          <w:bottom w:val="single" w:sz="4" w:space="0" w:color="auto"/>
-          <w:right w:val="single" w:sz="4" w:space="0" w:color="auto"/>
-          <w:insideH w:val="single" w:sz="4" w:space="0" w:color="auto"/>
-          <w:insideV w:val="single" w:sz="4" w:space="0" w:color="auto"/>
-        </w:tblBorders>
-        <w:tblLook w:val="04A0" w:firstRow="1" w:lastRow="0" w:firstColumn="1" w:lastColumn="0" w:noHBand="0" w:noVBand="1"/>
-      </w:tblPr>
-      <w:tblGrid>
-        <w:gridCol w:w="1764"/>
-        <w:gridCol w:w="1764"/>
-      </w:tblGrid>
-      <w:tr>
-        <w:tc>
-          <w:tcPr>
-            <w:tcW w:w="1764" w:type="dxa"/>
-          </w:tcPr>
-          <w:p>
-            <w:pPr>
-              <w:rPr>
-                <w:rFonts w:cs="David" w:hint="cs"/>
-                <w:b/>
-                <w:bCs/>
-                <w:sz w:val="28"/>
-                <w:szCs w:val="28"/>
-                <w:rtl/>
-              </w:rPr>
-            </w:pPr>
-            <w:r>
-              <w:rPr>
-                <w:rFonts w:cs="David" w:hint="cs"/>
-                <w:b/>
-                <w:bCs/>
-                <w:sz w:val="28"/>
-                <w:szCs w:val="28"/>
-                <w:rtl/>
-              </w:rPr>
-              <w:t>% הנחה</w:t>
-            </w:r>
-            <w:r>
-              <w:rPr>
-                <w:rFonts w:cs="David"/>
-                <w:b/>
-                <w:bCs/>
-                <w:sz w:val="28"/>
-                <w:szCs w:val="28"/>
-                <w:rtl/>
-              </w:rPr>
-              <w:br/>
-            </w:r>
-          </w:p>
-        </w:tc>
-        <w:tc>
-          <w:tcPr>
-            <w:tcW w:w="1764" w:type="dxa"/>
-          </w:tcPr>
-          <w:p>
-            <w:pPr>
-              <w:rPr>
-                <w:rFonts w:cs="David" w:hint="cs"/>
-                <w:b/>
-                <w:bCs/>
-                <w:sz w:val="28"/>
-                <w:szCs w:val="28"/>
-                <w:rtl/>
-              </w:rPr>
-            </w:pPr>
-            <w:r>
-              <w:rPr>
-                <w:rFonts w:cs="David" w:hint="cs"/>
-                <w:b/>
-                <w:bCs/>
-                <w:sz w:val="28"/>
-                <w:szCs w:val="28"/>
-                <w:rtl/>
-              </w:rPr>
-              <w:t xml:space="preserve">{discountPercent}</w:t>
-            </w:r>
-          </w:p>
-        </w:tc>
-      </w:tr>
-      <w:tr>
-        <w:tc>
-          <w:tcPr>
-            <w:tcW w:w="1764" w:type="dxa"/>
-          </w:tcPr>
-          <w:p>
-            <w:pPr>
-              <w:rPr>
-                <w:rFonts w:cs="David" w:hint="cs"/>
-                <w:b/>
-                <w:bCs/>
-                <w:sz w:val="28"/>
-                <w:szCs w:val="28"/>
-                <w:rtl/>
-              </w:rPr>
-            </w:pPr>
-            <w:r>
-              <w:rPr>
-                <w:rFonts w:cs="David" w:hint="cs"/>
-                <w:b/>
-                <w:bCs/>
-                <w:sz w:val="28"/>
-                <w:szCs w:val="28"/>
-                <w:rtl/>
-              </w:rPr>
-              <w:t>סה"כ לאחר הנחה</w:t>
-            </w:r>
-          </w:p>
-        </w:tc>
-        <w:tc>
-          <w:tcPr>
-            <w:tcW w:w="1764" w:type="dxa"/>
-          </w:tcPr>
-          <w:p>
-            <w:pPr>
-              <w:rPr>
-                <w:rFonts w:cs="David" w:hint="cs"/>
-                <w:b/>
-                <w:bCs/>
-                <w:sz w:val="28"/>
-                <w:szCs w:val="28"/>
-                <w:rtl/>
-              </w:rPr>
-            </w:pPr>
-            <w:r>
-              <w:rPr>
-                <w:rFonts w:cs="David" w:hint="cs"/>
-                <w:b/>
-                <w:bCs/>
-                <w:sz w:val="28"/>
-                <w:szCs w:val="28"/>
-                <w:rtl/>
-              </w:rPr>
-              <w:t xml:space="preserve">{subtotalAfterDiscount}</w:t>
-            </w:r>
-          </w:p>
-        </w:tc>
-      </w:tr>
-      <w:tr>
-        <w:tc>
-          <w:tcPr>
-            <w:tcW w:w="1764" w:type="dxa"/>
-          </w:tcPr>
-          <w:p>
-            <w:pPr>
-              <w:rPr>
-                <w:rFonts w:cs="David" w:hint="cs"/>
-                <w:b/>
-                <w:bCs/>
-                <w:sz w:val="28"/>
-                <w:szCs w:val="28"/>
-                <w:rtl/>
-              </w:rPr>
-            </w:pPr>
-            <w:r>
-              <w:rPr>
-                <w:rFonts w:cs="David" w:hint="cs"/>
-                <w:b/>
-                <w:bCs/>
-                <w:sz w:val="28"/>
-                <w:szCs w:val="28"/>
-                <w:rtl/>
-              </w:rPr>
-              <w:t>מע"מ 1</w:t>
-            </w:r>
-            <w:r>
-              <w:rPr>
-                <w:rFonts w:cs="David" w:hint="cs"/>
-                <w:b/>
-                <w:bCs/>
-                <w:sz w:val="28"/>
-                <w:szCs w:val="28"/>
-                <w:rtl/>
-              </w:rPr>
-              <w:t>8</w:t>
-            </w:r>
-            <w:r>
-              <w:rPr>
-                <w:rFonts w:cs="David" w:hint="cs"/>
-                <w:b/>
-                <w:bCs/>
-                <w:sz w:val="28"/>
-                <w:szCs w:val="28"/>
-                <w:rtl/>
-              </w:rPr>
-              <w:t>%</w:t>
-            </w:r>
-          </w:p>
-        </w:tc>
-        <w:tc>
-          <w:tcPr>
-            <w:tcW w:w="1764" w:type="dxa"/>
-          </w:tcPr>
-          <w:p>
-            <w:pPr>
-              <w:rPr>
-                <w:rFonts w:cs="David" w:hint="cs"/>
-                <w:b/>
-                <w:bCs/>
-                <w:sz w:val="28"/>
-                <w:szCs w:val="28"/>
-                <w:rtl/>
-              </w:rPr>
-            </w:pPr>
-            <w:r>
-              <w:rPr>
-                <w:rFonts w:cs="David" w:hint="cs"/>
-                <w:b/>
-                <w:bCs/>
-                <w:sz w:val="28"/>
-                <w:szCs w:val="28"/>
-                <w:rtl/>
-              </w:rPr>
-              <w:t xml:space="preserve">{vatAmount}</w:t>
-            </w:r>
-          </w:p>
-        </w:tc>
-      </w:tr>
-      <w:tr>
-        <w:tc>
-          <w:tcPr>
-            <w:tcW w:w="1764" w:type="dxa"/>
-          </w:tcPr>
-          <w:p>
-            <w:pPr>
-              <w:rPr>
-                <w:rFonts w:cs="David" w:hint="cs"/>
-                <w:b/>
-                <w:bCs/>
-                <w:sz w:val="28"/>
-                <w:szCs w:val="28"/>
-                <w:rtl/>
-              </w:rPr>
-            </w:pPr>
-            <w:r>
-              <w:rPr>
-                <w:rFonts w:cs="David" w:hint="cs"/>
-                <w:b/>
-                <w:bCs/>
-                <w:sz w:val="28"/>
-                <w:szCs w:val="28"/>
-                <w:rtl/>
-              </w:rPr>
-              <w:t xml:space="preserve">סה"כ לתשלום </w:t>
-            </w:r>
-          </w:p>
-        </w:tc>
-        <w:tc>
-          <w:tcPr>
-            <w:tcW w:w="1764" w:type="dxa"/>
-          </w:tcPr>
-          <w:p>
-            <w:pPr>
-              <w:rPr>
-                <w:rFonts w:cs="David" w:hint="cs"/>
-                <w:b/>
-                <w:bCs/>
-                <w:sz w:val="28"/>
-                <w:szCs w:val="28"/>
-                <w:rtl/>
-              </w:rPr>
-            </w:pPr>
-            <w:r>
-              <w:rPr>
-                <w:rFonts w:cs="David" w:hint="cs"/>
-                <w:b/>
-                <w:bCs/>
-                <w:sz w:val="28"/>
-                <w:szCs w:val="28"/>
-                <w:rtl/>
-              </w:rPr>
-              <w:t xml:space="preserve">{totalAmount}</w:t>
-            </w:r>
-          </w:p>
-        </w:tc>
-      </w:tr>
-    </w:tbl>
-    <w:p>
-      <w:pPr>
-        <w:rPr>
-          <w:vanish/>
-        </w:rPr>
-      </w:pPr>
-      <w:r>
-        <w:rPr>
-          <w:vanish/>
-        </w:rPr>
-        <w:t xml:space="preserve">{/hasDiscount}</w:t>
-      </w:r>
-    </w:p>
-    <w:p>
-      <w:pPr>
-        <w:rPr>
-          <w:rFonts w:cs="David"/>
-          <w:sz w:val="28"/>
-          <w:szCs w:val="28"/>
-          <w:rtl/>
-        </w:rPr>
-      </w:pPr>
-    </w:p>
-    <w:p>
-      <w:pPr>
-        <w:rPr>
-          <w:rFonts w:cs="David"/>
-          <w:sz w:val="28"/>
-          <w:szCs w:val="28"/>
-          <w:rtl/>
-        </w:rPr>
-      </w:pPr>
-    </w:p>
-    <w:p>
-      <w:pPr>
-        <w:rPr>
-          <w:rFonts w:cs="David"/>
-          <w:sz w:val="28"/>
-          <w:szCs w:val="28"/>
-          <w:rtl/>
-        </w:rPr>
-      </w:pPr>
-    </w:p>
-    <w:p>
-      <w:pPr>
-        <w:rPr>
-          <w:rFonts w:cs="David"/>
-          <w:sz w:val="28"/>
-          <w:szCs w:val="28"/>
-          <w:rtl/>
-        </w:rPr>
-      </w:pPr>
-    </w:p>
-    <w:p>
-      <w:pPr>
-        <w:rPr>
-          <w:rFonts w:cs="David"/>
-          <w:sz w:val="28"/>
-          <w:szCs w:val="28"/>
-          <w:rtl/>
-        </w:rPr>
-      </w:pPr>
-    </w:p>
-    <w:p>
-      <w:pPr>
-        <w:rPr>
-          <w:rFonts w:cs="David"/>
-          <w:sz w:val="28"/>
-          <w:szCs w:val="28"/>
-          <w:rtl/>
-        </w:rPr>
-      </w:pPr>
-    </w:p>
-    <w:p>
-      <w:pPr>
-        <w:rPr>
-          <w:rFonts w:cs="David"/>
-          <w:sz w:val="28"/>
-          <w:szCs w:val="28"/>
-          <w:rtl/>
-        </w:rPr>
-      </w:pPr>
-    </w:p>
-    <w:p>
-      <w:pPr>
-        <w:rPr>
-          <w:rFonts w:cs="David"/>
-          <w:sz w:val="28"/>
-          <w:szCs w:val="28"/>
-          <w:rtl/>
-        </w:rPr>
-      </w:pPr>
-    </w:p>
-    <w:p>
-      <w:pPr>
-        <w:rPr>
-          <w:rFonts w:cs="David"/>
-          <w:sz w:val="28"/>
-          <w:szCs w:val="28"/>
-          <w:rtl/>
-        </w:rPr>
-      </w:pPr>
-    </w:p>
-    <w:p>
-      <w:pPr>
-        <w:rPr>
-          <w:rFonts w:cs="David"/>
-          <w:sz w:val="28"/>
-          <w:szCs w:val="28"/>
-          <w:rtl/>
-        </w:rPr>
-      </w:pPr>
-    </w:p>
-    <w:p>
-      <w:pPr>
-        <w:rPr>
-          <w:vanish/>
-        </w:rPr>
-      </w:pPr>
-      <w:r>
-        <w:rPr>
-          <w:vanish/>
-        </w:rPr>
-        <w:t xml:space="preserve">{^hasDiscount}</w:t>
-      </w:r>
-    </w:p>
-    <w:tbl>
-      <w:tblPr>
-        <w:bidiVisual/>
-        <w:tblW w:w="0" w:type="auto"/>
-        <w:tblBorders>
-          <w:top w:val="single" w:sz="4" w:space="0" w:color="auto"/>
-          <w:left w:val="single" w:sz="4" w:space="0" w:color="auto"/>
-          <w:bottom w:val="single" w:sz="4" w:space="0" w:color="auto"/>
-          <w:right w:val="single" w:sz="4" w:space="0" w:color="auto"/>
-          <w:insideH w:val="single" w:sz="4" w:space="0" w:color="auto"/>
-          <w:insideV w:val="single" w:sz="4" w:space="0" w:color="auto"/>
-        </w:tblBorders>
-        <w:tblLook w:val="04A0" w:firstRow="1" w:lastRow="0" w:firstColumn="1" w:lastColumn="0" w:noHBand="0" w:noVBand="1"/>
-      </w:tblPr>
-      <w:tblGrid>
-        <w:gridCol w:w="911"/>
-        <w:gridCol w:w="911"/>
-        <w:gridCol w:w="3142"/>
-        <w:gridCol w:w="851"/>
-        <w:gridCol w:w="1177"/>
-        <w:gridCol w:w="1764"/>
-      </w:tblGrid>
-      <w:tr>
-        <w:tc>
-          <w:tcPr>
-            <w:tcW w:w="911" w:type="dxa"/>
+            <w:tcW w:w="700" w:type="dxa"/>
+            <w:tcBorders>
+              <w:top w:val="single" w:sz="4" w:space="0" w:color="auto"/>
+              <w:left w:val="single" w:sz="4" w:space="0" w:color="auto"/>
+              <w:bottom w:val="single" w:sz="4" w:space="0" w:color="auto"/>
+              <w:right w:val="single" w:sz="4" w:space="0" w:color="auto"/>
+            </w:tcBorders>
+            <w:hideMark/>
           </w:tcPr>
           <w:p>
             <w:pPr>
@@ -2461,7 +1620,7 @@
             </w:pPr>
             <w:r>
               <w:rPr>
-                <w:rFonts w:cs="David" w:hint="cs"/>
+                <w:rFonts w:cs="David"/>
                 <w:b/>
                 <w:bCs/>
                 <w:sz w:val="28"/>
@@ -2474,7 +1633,14 @@
         </w:tc>
         <w:tc>
           <w:tcPr>
-            <w:tcW w:w="911" w:type="dxa"/>
+            <w:tcW w:w="900" w:type="dxa"/>
+            <w:tcBorders>
+              <w:top w:val="single" w:sz="4" w:space="0" w:color="auto"/>
+              <w:left w:val="single" w:sz="4" w:space="0" w:color="auto"/>
+              <w:bottom w:val="single" w:sz="4" w:space="0" w:color="auto"/>
+              <w:right w:val="single" w:sz="4" w:space="0" w:color="auto"/>
+            </w:tcBorders>
+            <w:hideMark/>
           </w:tcPr>
           <w:p>
             <w:pPr>
@@ -2489,7 +1655,7 @@
             </w:pPr>
             <w:r>
               <w:rPr>
-                <w:rFonts w:cs="David" w:hint="cs"/>
+                <w:rFonts w:cs="David"/>
                 <w:b/>
                 <w:bCs/>
                 <w:sz w:val="28"/>
@@ -2502,7 +1668,14 @@
         </w:tc>
         <w:tc>
           <w:tcPr>
-            <w:tcW w:w="3142" w:type="dxa"/>
+            <w:tcW w:w="2900" w:type="dxa"/>
+            <w:tcBorders>
+              <w:top w:val="single" w:sz="4" w:space="0" w:color="auto"/>
+              <w:left w:val="single" w:sz="4" w:space="0" w:color="auto"/>
+              <w:bottom w:val="single" w:sz="4" w:space="0" w:color="auto"/>
+              <w:right w:val="single" w:sz="4" w:space="0" w:color="auto"/>
+            </w:tcBorders>
+            <w:hideMark/>
           </w:tcPr>
           <w:p>
             <w:pPr>
@@ -2517,7 +1690,7 @@
             </w:pPr>
             <w:r>
               <w:rPr>
-                <w:rFonts w:cs="David" w:hint="cs"/>
+                <w:rFonts w:cs="David"/>
                 <w:b/>
                 <w:bCs/>
                 <w:sz w:val="28"/>
@@ -2530,7 +1703,14 @@
         </w:tc>
         <w:tc>
           <w:tcPr>
-            <w:tcW w:w="851" w:type="dxa"/>
+            <w:tcW w:w="900" w:type="dxa"/>
+            <w:tcBorders>
+              <w:top w:val="single" w:sz="4" w:space="0" w:color="auto"/>
+              <w:left w:val="single" w:sz="4" w:space="0" w:color="auto"/>
+              <w:bottom w:val="single" w:sz="4" w:space="0" w:color="auto"/>
+              <w:right w:val="single" w:sz="4" w:space="0" w:color="auto"/>
+            </w:tcBorders>
+            <w:hideMark/>
           </w:tcPr>
           <w:p>
             <w:pPr>
@@ -2545,7 +1725,7 @@
             </w:pPr>
             <w:r>
               <w:rPr>
-                <w:rFonts w:cs="David" w:hint="cs"/>
+                <w:rFonts w:cs="David"/>
                 <w:b/>
                 <w:bCs/>
                 <w:sz w:val="28"/>
@@ -2558,7 +1738,14 @@
         </w:tc>
         <w:tc>
           <w:tcPr>
-            <w:tcW w:w="1177" w:type="dxa"/>
+            <w:tcW w:w="1400" w:type="dxa"/>
+            <w:tcBorders>
+              <w:top w:val="single" w:sz="4" w:space="0" w:color="auto"/>
+              <w:left w:val="single" w:sz="4" w:space="0" w:color="auto"/>
+              <w:bottom w:val="single" w:sz="4" w:space="0" w:color="auto"/>
+              <w:right w:val="single" w:sz="4" w:space="0" w:color="auto"/>
+            </w:tcBorders>
+            <w:hideMark/>
           </w:tcPr>
           <w:p>
             <w:pPr>
@@ -2573,7 +1760,7 @@
             </w:pPr>
             <w:r>
               <w:rPr>
-                <w:rFonts w:cs="David" w:hint="cs"/>
+                <w:rFonts w:cs="David"/>
                 <w:b/>
                 <w:bCs/>
                 <w:sz w:val="28"/>
@@ -2586,7 +1773,14 @@
         </w:tc>
         <w:tc>
           <w:tcPr>
-            <w:tcW w:w="1764" w:type="dxa"/>
+            <w:tcW w:w="1400" w:type="dxa"/>
+            <w:tcBorders>
+              <w:top w:val="single" w:sz="4" w:space="0" w:color="auto"/>
+              <w:left w:val="single" w:sz="4" w:space="0" w:color="auto"/>
+              <w:bottom w:val="single" w:sz="4" w:space="0" w:color="auto"/>
+              <w:right w:val="single" w:sz="4" w:space="0" w:color="auto"/>
+            </w:tcBorders>
+            <w:hideMark/>
           </w:tcPr>
           <w:p>
             <w:pPr>
@@ -2601,7 +1795,41 @@
             </w:pPr>
             <w:r>
               <w:rPr>
-                <w:rFonts w:cs="David" w:hint="cs"/>
+                <w:rFonts w:cs="David"/>
+                <w:b/>
+                <w:bCs/>
+                <w:sz w:val="28"/>
+                <w:szCs w:val="28"/>
+                <w:rtl/>
+              </w:rPr>
+              <w:t xml:space="preserve">% הנחה לשורה </w:t>
+            </w:r>
+          </w:p>
+        </w:tc>
+        <w:tc>
+          <w:tcPr>
+            <w:tcW w:w="2266" w:type="dxa"/>
+            <w:tcBorders>
+              <w:top w:val="single" w:sz="4" w:space="0" w:color="auto"/>
+              <w:left w:val="single" w:sz="4" w:space="0" w:color="auto"/>
+              <w:bottom w:val="single" w:sz="4" w:space="0" w:color="auto"/>
+              <w:right w:val="single" w:sz="4" w:space="0" w:color="auto"/>
+            </w:tcBorders>
+          </w:tcPr>
+          <w:p>
+            <w:pPr>
+              <w:rPr>
+                <w:rFonts w:cs="David"/>
+                <w:b/>
+                <w:bCs/>
+                <w:sz w:val="28"/>
+                <w:szCs w:val="28"/>
+                <w:rtl/>
+              </w:rPr>
+            </w:pPr>
+            <w:r>
+              <w:rPr>
+                <w:rFonts w:cs="David"/>
                 <w:b/>
                 <w:bCs/>
                 <w:sz w:val="28"/>
@@ -2628,7 +1856,574 @@
       <w:tr>
         <w:tc>
           <w:tcPr>
-            <w:tcW w:w="911" w:type="dxa"/>
+            <w:tcW w:w="700" w:type="dxa"/>
+            <w:tcBorders>
+              <w:top w:val="single" w:sz="4" w:space="0" w:color="auto"/>
+              <w:left w:val="single" w:sz="4" w:space="0" w:color="auto"/>
+              <w:bottom w:val="single" w:sz="4" w:space="0" w:color="auto"/>
+              <w:right w:val="single" w:sz="4" w:space="0" w:color="auto"/>
+            </w:tcBorders>
+          </w:tcPr>
+          <w:p>
+            <w:pPr>
+              <w:rPr>
+                <w:rFonts w:cs="David"/>
+                <w:b/>
+                <w:bCs/>
+                <w:sz w:val="28"/>
+                <w:szCs w:val="28"/>
+                <w:rtl/>
+              </w:rPr>
+            </w:pPr>
+            <w:bookmarkStart w:id="7" w:name="fldLine"/>
+            <w:bookmarkEnd w:id="7"/>
+            <w:r>
+              <w:rPr>
+                <w:rFonts w:cs="David" w:hint="cs"/>
+                <w:b/>
+                <w:bCs/>
+                <w:sz w:val="28"/>
+                <w:szCs w:val="28"/>
+                <w:rtl/>
+              </w:rPr>
+              <w:t>{#items}{lineNumber}</w:t>
+            </w:r>
+          </w:p>
+        </w:tc>
+        <w:tc>
+          <w:tcPr>
+            <w:tcW w:w="900" w:type="dxa"/>
+            <w:tcBorders>
+              <w:top w:val="single" w:sz="4" w:space="0" w:color="auto"/>
+              <w:left w:val="single" w:sz="4" w:space="0" w:color="auto"/>
+              <w:bottom w:val="single" w:sz="4" w:space="0" w:color="auto"/>
+              <w:right w:val="single" w:sz="4" w:space="0" w:color="auto"/>
+            </w:tcBorders>
+          </w:tcPr>
+          <w:p>
+            <w:pPr>
+              <w:rPr>
+                <w:rFonts w:cs="David"/>
+                <w:b/>
+                <w:bCs/>
+                <w:sz w:val="28"/>
+                <w:szCs w:val="28"/>
+                <w:rtl/>
+              </w:rPr>
+            </w:pPr>
+            <w:bookmarkStart w:id="8" w:name="fldMakat"/>
+            <w:bookmarkEnd w:id="8"/>
+            <w:r>
+              <w:rPr>
+                <w:rFonts w:cs="David" w:hint="cs"/>
+                <w:b/>
+                <w:bCs/>
+                <w:sz w:val="28"/>
+                <w:szCs w:val="28"/>
+                <w:rtl/>
+              </w:rPr>
+              <w:t>{</w:t>
+            </w:r>
+            <w:proofErr w:type="spellStart"/>
+            <w:r>
+              <w:rPr>
+                <w:rFonts w:cs="David" w:hint="cs"/>
+                <w:b/>
+                <w:bCs/>
+                <w:sz w:val="28"/>
+                <w:szCs w:val="28"/>
+                <w:rtl/>
+              </w:rPr>
+              <w:t>itemCode</w:t>
+            </w:r>
+            <w:proofErr w:type="spellEnd"/>
+            <w:r>
+              <w:rPr>
+                <w:rFonts w:cs="David" w:hint="cs"/>
+                <w:b/>
+                <w:bCs/>
+                <w:sz w:val="28"/>
+                <w:szCs w:val="28"/>
+                <w:rtl/>
+              </w:rPr>
+              <w:t>}</w:t>
+            </w:r>
+          </w:p>
+        </w:tc>
+        <w:tc>
+          <w:tcPr>
+            <w:tcW w:w="2900" w:type="dxa"/>
+            <w:tcBorders>
+              <w:top w:val="single" w:sz="4" w:space="0" w:color="auto"/>
+              <w:left w:val="single" w:sz="4" w:space="0" w:color="auto"/>
+              <w:bottom w:val="single" w:sz="4" w:space="0" w:color="auto"/>
+              <w:right w:val="single" w:sz="4" w:space="0" w:color="auto"/>
+            </w:tcBorders>
+          </w:tcPr>
+          <w:p>
+            <w:pPr>
+              <w:rPr>
+                <w:rFonts w:cs="David"/>
+                <w:b/>
+                <w:bCs/>
+                <w:sz w:val="28"/>
+                <w:szCs w:val="28"/>
+                <w:rtl/>
+              </w:rPr>
+            </w:pPr>
+            <w:bookmarkStart w:id="9" w:name="fldProduct"/>
+            <w:bookmarkEnd w:id="9"/>
+            <w:r>
+              <w:rPr>
+                <w:rFonts w:cs="David" w:hint="cs"/>
+                <w:b/>
+                <w:bCs/>
+                <w:sz w:val="28"/>
+                <w:szCs w:val="28"/>
+                <w:rtl/>
+              </w:rPr>
+              <w:t>{</w:t>
+            </w:r>
+            <w:proofErr w:type="spellStart"/>
+            <w:r>
+              <w:rPr>
+                <w:rFonts w:cs="David" w:hint="cs"/>
+                <w:b/>
+                <w:bCs/>
+                <w:sz w:val="28"/>
+                <w:szCs w:val="28"/>
+                <w:rtl/>
+              </w:rPr>
+              <w:t>description</w:t>
+            </w:r>
+            <w:proofErr w:type="spellEnd"/>
+            <w:r>
+              <w:rPr>
+                <w:rFonts w:cs="David" w:hint="cs"/>
+                <w:b/>
+                <w:bCs/>
+                <w:sz w:val="28"/>
+                <w:szCs w:val="28"/>
+                <w:rtl/>
+              </w:rPr>
+              <w:t>}</w:t>
+            </w:r>
+          </w:p>
+        </w:tc>
+        <w:tc>
+          <w:tcPr>
+            <w:tcW w:w="900" w:type="dxa"/>
+            <w:tcBorders>
+              <w:top w:val="single" w:sz="4" w:space="0" w:color="auto"/>
+              <w:left w:val="single" w:sz="4" w:space="0" w:color="auto"/>
+              <w:bottom w:val="single" w:sz="4" w:space="0" w:color="auto"/>
+              <w:right w:val="single" w:sz="4" w:space="0" w:color="auto"/>
+            </w:tcBorders>
+          </w:tcPr>
+          <w:p>
+            <w:pPr>
+              <w:rPr>
+                <w:rFonts w:cs="David"/>
+                <w:b/>
+                <w:bCs/>
+                <w:sz w:val="28"/>
+                <w:szCs w:val="28"/>
+                <w:rtl/>
+              </w:rPr>
+            </w:pPr>
+            <w:bookmarkStart w:id="10" w:name="fldAmmount"/>
+            <w:bookmarkEnd w:id="10"/>
+            <w:r>
+              <w:rPr>
+                <w:rFonts w:cs="David" w:hint="cs"/>
+                <w:b/>
+                <w:bCs/>
+                <w:sz w:val="28"/>
+                <w:szCs w:val="28"/>
+                <w:rtl/>
+              </w:rPr>
+              <w:t>{</w:t>
+            </w:r>
+            <w:proofErr w:type="spellStart"/>
+            <w:r>
+              <w:rPr>
+                <w:rFonts w:cs="David" w:hint="cs"/>
+                <w:b/>
+                <w:bCs/>
+                <w:sz w:val="28"/>
+                <w:szCs w:val="28"/>
+                <w:rtl/>
+              </w:rPr>
+              <w:t>quantity</w:t>
+            </w:r>
+            <w:proofErr w:type="spellEnd"/>
+            <w:r>
+              <w:rPr>
+                <w:rFonts w:cs="David" w:hint="cs"/>
+                <w:b/>
+                <w:bCs/>
+                <w:sz w:val="28"/>
+                <w:szCs w:val="28"/>
+                <w:rtl/>
+              </w:rPr>
+              <w:t>}</w:t>
+            </w:r>
+          </w:p>
+        </w:tc>
+        <w:tc>
+          <w:tcPr>
+            <w:tcW w:w="1400" w:type="dxa"/>
+            <w:tcBorders>
+              <w:top w:val="single" w:sz="4" w:space="0" w:color="auto"/>
+              <w:left w:val="single" w:sz="4" w:space="0" w:color="auto"/>
+              <w:bottom w:val="single" w:sz="4" w:space="0" w:color="auto"/>
+              <w:right w:val="single" w:sz="4" w:space="0" w:color="auto"/>
+            </w:tcBorders>
+          </w:tcPr>
+          <w:p>
+            <w:pPr>
+              <w:rPr>
+                <w:rFonts w:cs="David"/>
+                <w:b/>
+                <w:bCs/>
+                <w:sz w:val="28"/>
+                <w:szCs w:val="28"/>
+                <w:rtl/>
+              </w:rPr>
+            </w:pPr>
+            <w:bookmarkStart w:id="11" w:name="fldPrice"/>
+            <w:bookmarkEnd w:id="11"/>
+            <w:r>
+              <w:rPr>
+                <w:rFonts w:cs="David" w:hint="cs"/>
+                <w:b/>
+                <w:bCs/>
+                <w:sz w:val="28"/>
+                <w:szCs w:val="28"/>
+                <w:rtl/>
+              </w:rPr>
+              <w:t>{</w:t>
+            </w:r>
+            <w:proofErr w:type="spellStart"/>
+            <w:r>
+              <w:rPr>
+                <w:rFonts w:cs="David" w:hint="cs"/>
+                <w:b/>
+                <w:bCs/>
+                <w:sz w:val="28"/>
+                <w:szCs w:val="28"/>
+                <w:rtl/>
+              </w:rPr>
+              <w:t>unitPrice</w:t>
+            </w:r>
+            <w:proofErr w:type="spellEnd"/>
+            <w:r>
+              <w:rPr>
+                <w:rFonts w:cs="David" w:hint="cs"/>
+                <w:b/>
+                <w:bCs/>
+                <w:sz w:val="28"/>
+                <w:szCs w:val="28"/>
+                <w:rtl/>
+              </w:rPr>
+              <w:t>}</w:t>
+            </w:r>
+          </w:p>
+        </w:tc>
+        <w:tc>
+          <w:tcPr>
+            <w:tcW w:w="1400" w:type="dxa"/>
+            <w:tcBorders>
+              <w:top w:val="single" w:sz="4" w:space="0" w:color="auto"/>
+              <w:left w:val="single" w:sz="4" w:space="0" w:color="auto"/>
+              <w:bottom w:val="single" w:sz="4" w:space="0" w:color="auto"/>
+              <w:right w:val="single" w:sz="4" w:space="0" w:color="auto"/>
+            </w:tcBorders>
+          </w:tcPr>
+          <w:p>
+            <w:pPr>
+              <w:rPr>
+                <w:rFonts w:cs="David"/>
+                <w:b/>
+                <w:bCs/>
+                <w:sz w:val="28"/>
+                <w:szCs w:val="28"/>
+                <w:rtl/>
+              </w:rPr>
+            </w:pPr>
+            <w:bookmarkStart w:id="12" w:name="fldLineDiscount"/>
+            <w:bookmarkEnd w:id="12"/>
+            <w:r>
+              <w:rPr>
+                <w:rFonts w:cs="David" w:hint="cs"/>
+                <w:b/>
+                <w:bCs/>
+                <w:sz w:val="28"/>
+                <w:szCs w:val="28"/>
+                <w:rtl/>
+              </w:rPr>
+              <w:t>{</w:t>
+            </w:r>
+            <w:proofErr w:type="spellStart"/>
+            <w:r>
+              <w:rPr>
+                <w:rFonts w:cs="David" w:hint="cs"/>
+                <w:b/>
+                <w:bCs/>
+                <w:sz w:val="28"/>
+                <w:szCs w:val="28"/>
+                <w:rtl/>
+              </w:rPr>
+              <w:t>lineDiscountPercent</w:t>
+            </w:r>
+            <w:proofErr w:type="spellEnd"/>
+            <w:r>
+              <w:rPr>
+                <w:rFonts w:cs="David" w:hint="cs"/>
+                <w:b/>
+                <w:bCs/>
+                <w:sz w:val="28"/>
+                <w:szCs w:val="28"/>
+                <w:rtl/>
+              </w:rPr>
+              <w:t>}</w:t>
+            </w:r>
+          </w:p>
+        </w:tc>
+        <w:tc>
+          <w:tcPr>
+            <w:tcW w:w="2266" w:type="dxa"/>
+            <w:tcBorders>
+              <w:top w:val="single" w:sz="4" w:space="0" w:color="auto"/>
+              <w:left w:val="single" w:sz="4" w:space="0" w:color="auto"/>
+              <w:bottom w:val="single" w:sz="4" w:space="0" w:color="auto"/>
+              <w:right w:val="single" w:sz="4" w:space="0" w:color="auto"/>
+            </w:tcBorders>
+          </w:tcPr>
+          <w:p>
+            <w:pPr>
+              <w:rPr>
+                <w:rFonts w:cs="David"/>
+                <w:b/>
+                <w:bCs/>
+                <w:sz w:val="28"/>
+                <w:szCs w:val="28"/>
+                <w:rtl/>
+              </w:rPr>
+            </w:pPr>
+            <w:bookmarkStart w:id="13" w:name="fldLineTotal"/>
+            <w:bookmarkEnd w:id="13"/>
+            <w:r>
+              <w:rPr>
+                <w:rFonts w:cs="David" w:hint="cs"/>
+                <w:b/>
+                <w:bCs/>
+                <w:sz w:val="28"/>
+                <w:szCs w:val="28"/>
+                <w:rtl/>
+              </w:rPr>
+              <w:t>{</w:t>
+            </w:r>
+            <w:proofErr w:type="spellStart"/>
+            <w:r>
+              <w:rPr>
+                <w:rFonts w:cs="David" w:hint="cs"/>
+                <w:b/>
+                <w:bCs/>
+                <w:sz w:val="28"/>
+                <w:szCs w:val="28"/>
+                <w:rtl/>
+              </w:rPr>
+              <w:t>lineTotal</w:t>
+            </w:r>
+            <w:proofErr w:type="spellEnd"/>
+            <w:r>
+              <w:rPr>
+                <w:rFonts w:cs="David" w:hint="cs"/>
+                <w:b/>
+                <w:bCs/>
+                <w:sz w:val="28"/>
+                <w:szCs w:val="28"/>
+                <w:rtl/>
+              </w:rPr>
+              <w:t>}{/</w:t>
+            </w:r>
+            <w:proofErr w:type="spellStart"/>
+            <w:r>
+              <w:rPr>
+                <w:rFonts w:cs="David" w:hint="cs"/>
+                <w:b/>
+                <w:bCs/>
+                <w:sz w:val="28"/>
+                <w:szCs w:val="28"/>
+                <w:rtl/>
+              </w:rPr>
+              <w:t>items</w:t>
+            </w:r>
+            <w:proofErr w:type="spellEnd"/>
+            <w:r>
+              <w:rPr>
+                <w:rFonts w:cs="David" w:hint="cs"/>
+                <w:b/>
+                <w:bCs/>
+                <w:sz w:val="28"/>
+                <w:szCs w:val="28"/>
+                <w:rtl/>
+              </w:rPr>
+              <w:t>}</w:t>
+            </w:r>
+          </w:p>
+        </w:tc>
+      </w:tr>
+    </w:tbl>
+    <w:p>
+      <w:pPr>
+        <w:rPr>
+          <w:rFonts w:cs="David"/>
+          <w:vanish/>
+          <w:sz w:val="28"/>
+          <w:szCs w:val="28"/>
+          <w:rtl/>
+        </w:rPr>
+      </w:pPr>
+    </w:p>
+    <w:tbl>
+      <w:tblPr>
+        <w:tblpPr w:leftFromText="180" w:rightFromText="180" w:vertAnchor="text" w:horzAnchor="page" w:tblpX="67" w:tblpY="199"/>
+        <w:bidiVisual/>
+        <w:tblW w:w="0" w:type="auto"/>
+        <w:tblBorders>
+          <w:top w:val="single" w:sz="4" w:space="0" w:color="auto"/>
+          <w:left w:val="single" w:sz="4" w:space="0" w:color="auto"/>
+          <w:bottom w:val="single" w:sz="4" w:space="0" w:color="auto"/>
+          <w:right w:val="single" w:sz="4" w:space="0" w:color="auto"/>
+          <w:insideH w:val="single" w:sz="4" w:space="0" w:color="auto"/>
+          <w:insideV w:val="single" w:sz="4" w:space="0" w:color="auto"/>
+        </w:tblBorders>
+        <w:tblLook w:val="04A0" w:firstRow="1" w:lastRow="0" w:firstColumn="1" w:lastColumn="0" w:noHBand="0" w:noVBand="1"/>
+      </w:tblPr>
+      <w:tblGrid>
+        <w:gridCol w:w="1764"/>
+        <w:gridCol w:w="3145"/>
+      </w:tblGrid>
+      <w:tr>
+        <w:tc>
+          <w:tcPr>
+            <w:tcW w:w="1764" w:type="dxa"/>
+            <w:tcBorders>
+              <w:top w:val="single" w:sz="4" w:space="0" w:color="auto"/>
+              <w:left w:val="single" w:sz="4" w:space="0" w:color="auto"/>
+              <w:bottom w:val="single" w:sz="4" w:space="0" w:color="auto"/>
+              <w:right w:val="single" w:sz="4" w:space="0" w:color="auto"/>
+            </w:tcBorders>
+            <w:hideMark/>
+          </w:tcPr>
+          <w:p>
+            <w:pPr>
+              <w:rPr>
+                <w:rFonts w:cs="David"/>
+                <w:b/>
+                <w:bCs/>
+                <w:sz w:val="28"/>
+                <w:szCs w:val="28"/>
+              </w:rPr>
+            </w:pPr>
+            <w:r>
+              <w:rPr>
+                <w:rFonts w:cs="David"/>
+                <w:b/>
+                <w:bCs/>
+                <w:sz w:val="28"/>
+                <w:szCs w:val="28"/>
+                <w:rtl/>
+              </w:rPr>
+              <w:t>% הנחה</w:t>
+            </w:r>
+            <w:r>
+              <w:rPr>
+                <w:rFonts w:cs="David"/>
+                <w:b/>
+                <w:bCs/>
+                <w:sz w:val="28"/>
+                <w:szCs w:val="28"/>
+                <w:rtl/>
+              </w:rPr>
+              <w:br/>
+            </w:r>
+          </w:p>
+        </w:tc>
+        <w:tc>
+          <w:tcPr>
+            <w:tcW w:w="2414" w:type="dxa"/>
+            <w:tcBorders>
+              <w:top w:val="single" w:sz="4" w:space="0" w:color="auto"/>
+              <w:left w:val="single" w:sz="4" w:space="0" w:color="auto"/>
+              <w:bottom w:val="single" w:sz="4" w:space="0" w:color="auto"/>
+              <w:right w:val="single" w:sz="4" w:space="0" w:color="auto"/>
+            </w:tcBorders>
+          </w:tcPr>
+          <w:p>
+            <w:pPr>
+              <w:rPr>
+                <w:rFonts w:cs="David"/>
+                <w:b/>
+                <w:bCs/>
+                <w:sz w:val="28"/>
+                <w:szCs w:val="28"/>
+                <w:rtl/>
+              </w:rPr>
+            </w:pPr>
+            <w:bookmarkStart w:id="14" w:name="fldDiscount"/>
+            <w:bookmarkEnd w:id="14"/>
+            <w:r>
+              <w:rPr>
+                <w:rFonts w:cs="David" w:hint="cs"/>
+                <w:b/>
+                <w:bCs/>
+                <w:sz w:val="28"/>
+                <w:szCs w:val="28"/>
+                <w:rtl/>
+              </w:rPr>
+              <w:t>{</w:t>
+            </w:r>
+            <w:proofErr w:type="spellStart"/>
+            <w:r>
+              <w:rPr>
+                <w:rFonts w:cs="David" w:hint="cs"/>
+                <w:b/>
+                <w:bCs/>
+                <w:sz w:val="28"/>
+                <w:szCs w:val="28"/>
+                <w:rtl/>
+              </w:rPr>
+              <w:t>discountPercent</w:t>
+            </w:r>
+            <w:proofErr w:type="spellEnd"/>
+            <w:r>
+              <w:rPr>
+                <w:rFonts w:cs="David" w:hint="cs"/>
+                <w:b/>
+                <w:bCs/>
+                <w:sz w:val="28"/>
+                <w:szCs w:val="28"/>
+                <w:rtl/>
+              </w:rPr>
+              <w:t>}</w:t>
+            </w:r>
+          </w:p>
+        </w:tc>
+      </w:tr>
+      <w:tr>
+        <w:tc>
+          <w:tcPr>
+            <w:tcW w:w="1764" w:type="dxa"/>
+            <w:tcBorders>
+              <w:top w:val="single" w:sz="4" w:space="0" w:color="auto"/>
+              <w:left w:val="single" w:sz="4" w:space="0" w:color="auto"/>
+              <w:bottom w:val="single" w:sz="4" w:space="0" w:color="auto"/>
+              <w:right w:val="single" w:sz="4" w:space="0" w:color="auto"/>
+            </w:tcBorders>
+            <w:hideMark/>
           </w:tcPr>
           <w:p>
             <w:pPr>
@@ -2643,6 +2438,42 @@
             </w:pPr>
             <w:r>
               <w:rPr>
+                <w:rFonts w:cs="David"/>
+                <w:b/>
+                <w:bCs/>
+                <w:sz w:val="28"/>
+                <w:szCs w:val="28"/>
+                <w:rtl/>
+              </w:rPr>
+              <w:t>סה"כ לאחר הנחה</w:t>
+            </w:r>
+          </w:p>
+        </w:tc>
+        <w:tc>
+          <w:tcPr>
+            <w:tcW w:w="2414" w:type="dxa"/>
+            <w:tcBorders>
+              <w:top w:val="single" w:sz="4" w:space="0" w:color="auto"/>
+              <w:left w:val="single" w:sz="4" w:space="0" w:color="auto"/>
+              <w:bottom w:val="single" w:sz="4" w:space="0" w:color="auto"/>
+              <w:right w:val="single" w:sz="4" w:space="0" w:color="auto"/>
+            </w:tcBorders>
+          </w:tcPr>
+          <w:p>
+            <w:pPr>
+              <w:rPr>
+                <w:rFonts w:cs="David"/>
+                <w:b/>
+                <w:bCs/>
+                <w:sz w:val="28"/>
+                <w:szCs w:val="28"/>
+                <w:rtl/>
+              </w:rPr>
+            </w:pPr>
+            <w:bookmarkStart w:id="15" w:name="fldTotalAfterDiscount"/>
+            <w:bookmarkEnd w:id="15"/>
+            <w:r>
+              <w:rPr>
                 <w:rFonts w:cs="David" w:hint="cs"/>
                 <w:b/>
                 <w:bCs/>
@@ -2650,13 +2481,46 @@
                 <w:szCs w:val="28"/>
                 <w:rtl/>
               </w:rPr>
-              <w:t xml:space="preserve">{#items}{lineNumber}</w:t>
+              <w:t>{</w:t>
+            </w:r>
+            <w:proofErr w:type="spellStart"/>
+            <w:r>
+              <w:rPr>
+                <w:rFonts w:cs="David" w:hint="cs"/>
+                <w:b/>
+                <w:bCs/>
+                <w:sz w:val="28"/>
+                <w:szCs w:val="28"/>
+                <w:rtl/>
+              </w:rPr>
+              <w:t>subtotalAfterDiscount</w:t>
+            </w:r>
+            <w:proofErr w:type="spellEnd"/>
+            <w:r>
+              <w:rPr>
+                <w:rFonts w:cs="David" w:hint="cs"/>
+                <w:b/>
+                <w:bCs/>
+                <w:sz w:val="28"/>
+                <w:szCs w:val="28"/>
+                <w:rtl/>
+              </w:rPr>
+              <w:t>}</w:t>
             </w:r>
           </w:p>
         </w:tc>
+      </w:tr>
+      <w:tr>
         <w:tc>
           <w:tcPr>
-            <w:tcW w:w="911" w:type="dxa"/>
+            <w:tcW w:w="1764" w:type="dxa"/>
+            <w:tcBorders>
+              <w:top w:val="single" w:sz="4" w:space="0" w:color="auto"/>
+              <w:left w:val="single" w:sz="4" w:space="0" w:color="auto"/>
+              <w:bottom w:val="single" w:sz="4" w:space="0" w:color="auto"/>
+              <w:right w:val="single" w:sz="4" w:space="0" w:color="auto"/>
+            </w:tcBorders>
+            <w:hideMark/>
           </w:tcPr>
           <w:p>
             <w:pPr>
@@ -2671,6 +2535,42 @@
             </w:pPr>
             <w:r>
               <w:rPr>
+                <w:rFonts w:cs="David"/>
+                <w:b/>
+                <w:bCs/>
+                <w:sz w:val="28"/>
+                <w:szCs w:val="28"/>
+                <w:rtl/>
+              </w:rPr>
+              <w:t>מע"מ 18%</w:t>
+            </w:r>
+          </w:p>
+        </w:tc>
+        <w:tc>
+          <w:tcPr>
+            <w:tcW w:w="2414" w:type="dxa"/>
+            <w:tcBorders>
+              <w:top w:val="single" w:sz="4" w:space="0" w:color="auto"/>
+              <w:left w:val="single" w:sz="4" w:space="0" w:color="auto"/>
+              <w:bottom w:val="single" w:sz="4" w:space="0" w:color="auto"/>
+              <w:right w:val="single" w:sz="4" w:space="0" w:color="auto"/>
+            </w:tcBorders>
+          </w:tcPr>
+          <w:p>
+            <w:pPr>
+              <w:rPr>
+                <w:rFonts w:cs="David"/>
+                <w:b/>
+                <w:bCs/>
+                <w:sz w:val="28"/>
+                <w:szCs w:val="28"/>
+                <w:rtl/>
+              </w:rPr>
+            </w:pPr>
+            <w:bookmarkStart w:id="16" w:name="fldMAAM"/>
+            <w:bookmarkEnd w:id="16"/>
+            <w:r>
+              <w:rPr>
                 <w:rFonts w:cs="David" w:hint="cs"/>
                 <w:b/>
                 <w:bCs/>
@@ -2678,13 +2578,46 @@
                 <w:szCs w:val="28"/>
                 <w:rtl/>
               </w:rPr>
-              <w:t xml:space="preserve">{itemCode}</w:t>
+              <w:t>{</w:t>
+            </w:r>
+            <w:proofErr w:type="spellStart"/>
+            <w:r>
+              <w:rPr>
+                <w:rFonts w:cs="David" w:hint="cs"/>
+                <w:b/>
+                <w:bCs/>
+                <w:sz w:val="28"/>
+                <w:szCs w:val="28"/>
+                <w:rtl/>
+              </w:rPr>
+              <w:t>vatAmount</w:t>
+            </w:r>
+            <w:proofErr w:type="spellEnd"/>
+            <w:r>
+              <w:rPr>
+                <w:rFonts w:cs="David" w:hint="cs"/>
+                <w:b/>
+                <w:bCs/>
+                <w:sz w:val="28"/>
+                <w:szCs w:val="28"/>
+                <w:rtl/>
+              </w:rPr>
+              <w:t>}</w:t>
             </w:r>
           </w:p>
         </w:tc>
+      </w:tr>
+      <w:tr>
         <w:tc>
           <w:tcPr>
-            <w:tcW w:w="3142" w:type="dxa"/>
+            <w:tcW w:w="1764" w:type="dxa"/>
+            <w:tcBorders>
+              <w:top w:val="single" w:sz="4" w:space="0" w:color="auto"/>
+              <w:left w:val="single" w:sz="4" w:space="0" w:color="auto"/>
+              <w:bottom w:val="single" w:sz="4" w:space="0" w:color="auto"/>
+              <w:right w:val="single" w:sz="4" w:space="0" w:color="auto"/>
+            </w:tcBorders>
+            <w:hideMark/>
           </w:tcPr>
           <w:p>
             <w:pPr>
@@ -2699,20 +2632,26 @@
             </w:pPr>
             <w:r>
               <w:rPr>
-                <w:rFonts w:cs="David" w:hint="cs"/>
+                <w:rFonts w:cs="David"/>
                 <w:b/>
                 <w:bCs/>
                 <w:sz w:val="28"/>
                 <w:szCs w:val="28"/>
                 <w:rtl/>
               </w:rPr>
-              <w:t xml:space="preserve">{description}</w:t>
+              <w:t xml:space="preserve">סה"כ לתשלום </w:t>
             </w:r>
           </w:p>
         </w:tc>
         <w:tc>
           <w:tcPr>
-            <w:tcW w:w="851" w:type="dxa"/>
+            <w:tcW w:w="2414" w:type="dxa"/>
+            <w:tcBorders>
+              <w:top w:val="single" w:sz="4" w:space="0" w:color="auto"/>
+              <w:left w:val="single" w:sz="4" w:space="0" w:color="auto"/>
+              <w:bottom w:val="single" w:sz="4" w:space="0" w:color="auto"/>
+              <w:right w:val="single" w:sz="4" w:space="0" w:color="auto"/>
+            </w:tcBorders>
           </w:tcPr>
           <w:p>
             <w:pPr>
@@ -2725,6 +2664,8 @@
                 <w:rtl/>
               </w:rPr>
             </w:pPr>
+            <w:bookmarkStart w:id="17" w:name="fldTotalAfterMaaM"/>
+            <w:bookmarkEnd w:id="17"/>
             <w:r>
               <w:rPr>
                 <w:rFonts w:cs="David" w:hint="cs"/>
@@ -2734,25 +2675,9 @@
                 <w:szCs w:val="28"/>
                 <w:rtl/>
               </w:rPr>
-              <w:t xml:space="preserve">{quantity}</w:t>
+              <w:t>{</w:t>
             </w:r>
-          </w:p>
-        </w:tc>
-        <w:tc>
-          <w:tcPr>
-            <w:tcW w:w="1177" w:type="dxa"/>
-          </w:tcPr>
-          <w:p>
-            <w:pPr>
-              <w:rPr>
-                <w:rFonts w:cs="David"/>
-                <w:b/>
-                <w:bCs/>
-                <w:sz w:val="28"/>
-                <w:szCs w:val="28"/>
-                <w:rtl/>
-              </w:rPr>
-            </w:pPr>
+            <w:proofErr w:type="spellStart"/>
             <w:r>
               <w:rPr>
                 <w:rFonts w:cs="David" w:hint="cs"/>
@@ -2762,25 +2687,9 @@
                 <w:szCs w:val="28"/>
                 <w:rtl/>
               </w:rPr>
-              <w:t xml:space="preserve">{unitPrice}</w:t>
+              <w:t>totalAmount</w:t>
             </w:r>
-          </w:p>
-        </w:tc>
-        <w:tc>
-          <w:tcPr>
-            <w:tcW w:w="1764" w:type="dxa"/>
-          </w:tcPr>
-          <w:p>
-            <w:pPr>
-              <w:rPr>
-                <w:rFonts w:cs="David" w:hint="cs"/>
-                <w:b/>
-                <w:bCs/>
-                <w:sz w:val="28"/>
-                <w:szCs w:val="28"/>
-                <w:rtl/>
-              </w:rPr>
-            </w:pPr>
+            <w:proofErr w:type="spellEnd"/>
             <w:r>
               <w:rPr>
                 <w:rFonts w:cs="David" w:hint="cs"/>
@@ -2790,230 +2699,7 @@
                 <w:szCs w:val="28"/>
                 <w:rtl/>
               </w:rPr>
-              <w:t xml:space="preserve">{lineTotal}{/items}</w:t>
-            </w:r>
-          </w:p>
-        </w:tc>
-      </w:tr>
-    </w:tbl>
-    <w:p>
-      <w:pPr>
-        <w:rPr>
-          <w:vanish/>
-        </w:rPr>
-      </w:pPr>
-    </w:p>
-    <w:tbl>
-      <w:tblPr>
-        <w:tblpPr w:leftFromText="180" w:rightFromText="180" w:vertAnchor="text" w:horzAnchor="page" w:tblpX="2434" w:tblpY="249"/>
-        <w:bidiVisual/>
-        <w:tblW w:w="0" w:type="auto"/>
-        <w:tblBorders>
-          <w:top w:val="single" w:sz="4" w:space="0" w:color="auto"/>
-          <w:left w:val="single" w:sz="4" w:space="0" w:color="auto"/>
-          <w:bottom w:val="single" w:sz="4" w:space="0" w:color="auto"/>
-          <w:right w:val="single" w:sz="4" w:space="0" w:color="auto"/>
-          <w:insideH w:val="single" w:sz="4" w:space="0" w:color="auto"/>
-          <w:insideV w:val="single" w:sz="4" w:space="0" w:color="auto"/>
-        </w:tblBorders>
-        <w:tblLook w:val="04A0" w:firstRow="1" w:lastRow="0" w:firstColumn="1" w:lastColumn="0" w:noHBand="0" w:noVBand="1"/>
-      </w:tblPr>
-      <w:tblGrid>
-        <w:gridCol w:w="1764"/>
-        <w:gridCol w:w="1764"/>
-      </w:tblGrid>
-      <w:tr>
-        <w:tc>
-          <w:tcPr>
-            <w:tcW w:w="1764" w:type="dxa"/>
-          </w:tcPr>
-          <w:p>
-            <w:pPr>
-              <w:rPr>
-                <w:rFonts w:cs="David"/>
-                <w:b/>
-                <w:bCs/>
-                <w:sz w:val="28"/>
-                <w:szCs w:val="28"/>
-                <w:rtl/>
-              </w:rPr>
-            </w:pPr>
-            <w:r>
-              <w:rPr>
-                <w:rFonts w:cs="David" w:hint="cs"/>
-                <w:b/>
-                <w:bCs/>
-                <w:sz w:val="28"/>
-                <w:szCs w:val="28"/>
-                <w:rtl/>
-              </w:rPr>
-              <w:t>סה"כ</w:t>
-            </w:r>
-          </w:p>
-        </w:tc>
-        <w:tc>
-          <w:tcPr>
-            <w:tcW w:w="1764" w:type="dxa"/>
-          </w:tcPr>
-          <w:p>
-            <w:pPr>
-              <w:rPr>
-                <w:rFonts w:cs="David"/>
-                <w:b/>
-                <w:bCs/>
-                <w:sz w:val="28"/>
-                <w:szCs w:val="28"/>
-                <w:rtl/>
-              </w:rPr>
-            </w:pPr>
-            <w:r>
-              <w:rPr>
-                <w:rFonts w:cs="David" w:hint="cs"/>
-                <w:b/>
-                <w:bCs/>
-                <w:sz w:val="28"/>
-                <w:szCs w:val="28"/>
-                <w:rtl/>
-              </w:rPr>
-              <w:t xml:space="preserve">{subtotalAfterDiscount}</w:t>
-            </w:r>
-          </w:p>
-        </w:tc>
-      </w:tr>
-      <w:tr>
-        <w:tc>
-          <w:tcPr>
-            <w:tcW w:w="1764" w:type="dxa"/>
-          </w:tcPr>
-          <w:p>
-            <w:pPr>
-              <w:rPr>
-                <w:rFonts w:cs="David"/>
-                <w:b/>
-                <w:bCs/>
-                <w:sz w:val="28"/>
-                <w:szCs w:val="28"/>
-                <w:rtl/>
-              </w:rPr>
-            </w:pPr>
-            <w:r>
-              <w:rPr>
-                <w:rFonts w:cs="David" w:hint="cs"/>
-                <w:b/>
-                <w:bCs/>
-                <w:sz w:val="28"/>
-                <w:szCs w:val="28"/>
-                <w:rtl/>
-              </w:rPr>
-              <w:t>מע"מ 1</w:t>
-            </w:r>
-            <w:r>
-              <w:rPr>
-                <w:rFonts w:cs="David" w:hint="cs"/>
-                <w:b/>
-                <w:bCs/>
-                <w:sz w:val="28"/>
-                <w:szCs w:val="28"/>
-                <w:rtl/>
-              </w:rPr>
-              <w:t>8</w:t>
-            </w:r>
-            <w:r>
-              <w:rPr>
-                <w:rFonts w:cs="David" w:hint="cs"/>
-                <w:b/>
-                <w:bCs/>
-                <w:sz w:val="28"/>
-                <w:szCs w:val="28"/>
-                <w:rtl/>
-              </w:rPr>
-              <w:t>%</w:t>
-            </w:r>
-          </w:p>
-        </w:tc>
-        <w:tc>
-          <w:tcPr>
-            <w:tcW w:w="1764" w:type="dxa"/>
-          </w:tcPr>
-          <w:p>
-            <w:pPr>
-              <w:rPr>
-                <w:rFonts w:cs="David"/>
-                <w:b/>
-                <w:bCs/>
-                <w:sz w:val="28"/>
-                <w:szCs w:val="28"/>
-                <w:rtl/>
-              </w:rPr>
-            </w:pPr>
-            <w:r>
-              <w:rPr>
-                <w:rFonts w:cs="David" w:hint="cs"/>
-                <w:b/>
-                <w:bCs/>
-                <w:sz w:val="28"/>
-                <w:szCs w:val="28"/>
-                <w:rtl/>
-              </w:rPr>
-              <w:t xml:space="preserve">{vatAmount}</w:t>
-            </w:r>
-          </w:p>
-        </w:tc>
-      </w:tr>
-      <w:tr>
-        <w:tc>
-          <w:tcPr>
-            <w:tcW w:w="1764" w:type="dxa"/>
-          </w:tcPr>
-          <w:p>
-            <w:pPr>
-              <w:rPr>
-                <w:rFonts w:cs="David"/>
-                <w:b/>
-                <w:bCs/>
-                <w:sz w:val="28"/>
-                <w:szCs w:val="28"/>
-                <w:rtl/>
-              </w:rPr>
-            </w:pPr>
-            <w:r>
-              <w:rPr>
-                <w:rFonts w:cs="David" w:hint="cs"/>
-                <w:b/>
-                <w:bCs/>
-                <w:sz w:val="28"/>
-                <w:szCs w:val="28"/>
-                <w:rtl/>
-              </w:rPr>
-              <w:t xml:space="preserve">סה"כ לתשלום </w:t>
-            </w:r>
-          </w:p>
-        </w:tc>
-        <w:tc>
-          <w:tcPr>
-            <w:tcW w:w="1764" w:type="dxa"/>
-          </w:tcPr>
-          <w:p>
-            <w:pPr>
-              <w:rPr>
-                <w:rFonts w:cs="David"/>
-                <w:b/>
-                <w:bCs/>
-                <w:sz w:val="28"/>
-                <w:szCs w:val="28"/>
-                <w:rtl/>
-              </w:rPr>
-            </w:pPr>
-            <w:r>
-              <w:rPr>
-                <w:rFonts w:cs="David" w:hint="cs"/>
-                <w:b/>
-                <w:bCs/>
-                <w:sz w:val="28"/>
-                <w:szCs w:val="28"/>
-                <w:rtl/>
-              </w:rPr>
-              <w:t xml:space="preserve">{totalAmount}</w:t>
+              <w:t>}</w:t>
             </w:r>
           </w:p>
         </w:tc>

</xml_diff>